<commit_message>
docs: QA test 14 pin-hole notice appears on download (#274, 1.3.35-beta)
Co-Authored-By: Claude Opus 5.5 <noreply@anthropic.com>
Claude-Session: https://claude.ai/code/session_017HvDcuheawf6ger4p9Vj6i
</commit_message>
<xml_diff>
--- a/qa/bambu-suite.docx
+++ b/qa/bambu-suite.docx
@@ -5138,7 +5138,7 @@
         <w:t xml:space="preserve">test-cuts/kerf-test.svg</w:t>
       </w:r>
       <w:r>
-        <w:t xml:space="preserve">. A notice says a hole is narrower than the kerf and was left as drawn: that's the pin hole.</w:t>
+        <w:t xml:space="preserve">.</w:t>
       </w:r>
     </w:p>
     <w:p>
@@ -5150,7 +5150,7 @@
         </w:numPr>
       </w:pPr>
       <w:r>
-        <w:t xml:space="preserve">Download the plate and import it. The download says kerf compensation is built in.</w:t>
+        <w:t xml:space="preserve">Download the plate and import it. The download says kerf compensation is built in, and that a hole is narrower than the kerf and was left as drawn: that's the pin hole.</w:t>
       </w:r>
     </w:p>
     <w:p>

</xml_diff>

<commit_message>
docs: QA workbooks test 1.4.0-beta; test 22 lists the pin-hole notice (#373, #380, 1.4.6-beta)
Co-Authored-By: Claude Opus 5.5 <noreply@anthropic.com>
Claude-Session: https://claude.ai/code/session_017HvDcuheawf6ger4p9Vj6i
</commit_message>
<xml_diff>
--- a/qa/bambu-suite.docx
+++ b/qa/bambu-suite.docx
@@ -18,7 +18,7 @@
         <w:rPr>
           <w:b/>
         </w:rPr>
-        <w:t xml:space="preserve">SnugCut 1.2.1-beta</w:t>
+        <w:t xml:space="preserve">SnugCut 1.4.0-beta</w:t>
       </w:r>
       <w:r>
         <w:t xml:space="preserve">. Results go to </w:t>
@@ -376,7 +376,7 @@
           <w:rPr>
             <w:rStyle w:val="Hyperlink"/>
           </w:rPr>
-          <w:t xml:space="preserve">https://github.com/cyvaquero/snugcut/archive/refs/tags/1.2.1-beta.zip</w:t>
+          <w:t xml:space="preserve">https://github.com/cyvaquero/snugcut/archive/refs/tags/1.4.0-beta.zip</w:t>
         </w:r>
       </w:hyperlink>
       <w:r>
@@ -425,7 +425,7 @@
         <w:rPr>
           <w:b/>
         </w:rPr>
-        <w:t xml:space="preserve">The footer must show v1.2.1-beta.</w:t>
+        <w:t xml:space="preserve">The footer must show v1.4.0-beta.</w:t>
       </w:r>
     </w:p>
     <w:p>
@@ -7888,7 +7888,16 @@
         <w:t xml:space="preserve">test-cuts/kerf-test.svg</w:t>
       </w:r>
       <w:r>
-        <w:t xml:space="preserve">, download the plate and import it. The download says kerf compensation is built in and that filled areas are written as their outlines.</w:t>
+        <w:t xml:space="preserve">, download the plate and import it. The download says kerf compensation is built in, that filled areas are written as their outlines, and that a hole in </w:t>
+      </w:r>
+      <w:r>
+        <w:rPr>
+          <w:rFonts w:ascii="Consolas" w:hAnsi="Consolas" w:cs="Consolas"/>
+        </w:rPr>
+        <w:t xml:space="preserve">kerf-test.svg</w:t>
+      </w:r>
+      <w:r>
+        <w:t xml:space="preserve"> is narrower than the kerf, so it was left as drawn (the pin hole).</w:t>
       </w:r>
     </w:p>
     <w:p>

</xml_diff>

<commit_message>
docs: QA workbooks test 1.4.0.1-beta (#49, #50, #51, #52, #132, #133) (1.4.23-beta)
Co-Authored-By: Claude Opus 5.5 <noreply@anthropic.com>
Claude-Session: https://claude.ai/code/session_017HvDcuheawf6ger4p9Vj6i
</commit_message>
<xml_diff>
--- a/qa/bambu-suite.docx
+++ b/qa/bambu-suite.docx
@@ -18,7 +18,7 @@
         <w:rPr>
           <w:b/>
         </w:rPr>
-        <w:t xml:space="preserve">SnugCut 1.4.0-beta</w:t>
+        <w:t xml:space="preserve">SnugCut 1.4.0.1-beta</w:t>
       </w:r>
       <w:r>
         <w:t xml:space="preserve">. Results go to </w:t>
@@ -376,7 +376,7 @@
           <w:rPr>
             <w:rStyle w:val="Hyperlink"/>
           </w:rPr>
-          <w:t xml:space="preserve">https://github.com/cyvaquero/snugcut/archive/refs/tags/1.4.0-beta.zip</w:t>
+          <w:t xml:space="preserve">https://github.com/cyvaquero/snugcut/archive/refs/tags/1.4.0.1-beta.zip</w:t>
         </w:r>
       </w:hyperlink>
       <w:r>
@@ -425,7 +425,7 @@
         <w:rPr>
           <w:b/>
         </w:rPr>
-        <w:t xml:space="preserve">The footer must show v1.4.0-beta.</w:t>
+        <w:t xml:space="preserve">The footer must show v1.4.0.1-beta.</w:t>
       </w:r>
     </w:p>
     <w:p>

</xml_diff>